<commit_message>
refactor: make steward the artwork relationship term
</commit_message>
<xml_diff>
--- a/docs/Artwork Registry - A Living Lineage.docx
+++ b/docs/Artwork Registry - A Living Lineage.docx
@@ -158,7 +158,7 @@
           <w:color w:val="262321"/>
           <w:sz w:val="22"/>
         </w:rPr>
-        <w:t>An artwork can carry more than a certificate. It can carry a continuous relationship between object, maker, keeper, place, material and meaning. The Adrian Rasmussen Artwork Registry gives each physical work one permanent identity and a protected history that can continue long after the first sale.</w:t>
+        <w:t>An artwork can carry more than a certificate. It can carry a continuous relationship between object, maker, steward, place, material and meaning. The Adrian Rasmussen Artwork Registry gives each physical work one permanent identity and a protected history that can continue long after the first sale.</w:t>
       </w:r>
     </w:p>
     <w:p>
@@ -259,7 +259,7 @@
           <w:color w:val="262321"/>
           <w:sz w:val="22"/>
         </w:rPr>
-        <w:t>The sequence of keepers who carried it through the world.</w:t>
+        <w:t>The sequence of stewards who carried it through the world.</w:t>
       </w:r>
     </w:p>
     <w:p>
@@ -291,7 +291,7 @@
           <w:color w:val="262321"/>
           <w:sz w:val="22"/>
         </w:rPr>
-        <w:t>Dreams, dedications and inscriptions that keepers choose to contribute.</w:t>
+        <w:t>Dreams, dedications and inscriptions that stewards choose to contribute.</w:t>
       </w:r>
     </w:p>
     <w:p>
@@ -307,7 +307,7 @@
           <w:color w:val="262321"/>
           <w:sz w:val="22"/>
         </w:rPr>
-        <w:t>The ability to recover custody when a keeper dies or disappears.</w:t>
+        <w:t>The ability to recover custody when a steward dies or disappears.</w:t>
       </w:r>
     </w:p>
     <w:p>
@@ -528,7 +528,7 @@
           <w:color w:val="262321"/>
           <w:sz w:val="22"/>
         </w:rPr>
-        <w:t>The code is not rotated during ordinary transfers. It lives with the art. A person who possesses the piece can eventually recover it into their verified account, but the code never silently overrides a current keeper.</w:t>
+        <w:t>The code is not rotated during ordinary transfers. It lives with the art. A person who possesses the piece can eventually recover it into their verified account, but the code never silently overrides a current steward.</w:t>
       </w:r>
     </w:p>
     <w:p>
@@ -608,7 +608,7 @@
           <w:color w:val="262321"/>
           <w:sz w:val="22"/>
         </w:rPr>
-        <w:t>AdrianRasmussen.com is the permanent home and only writable authority. It holds identity, keeper state, transfers, inscriptions, provenance, privacy controls and recovery evidence.</w:t>
+        <w:t>AdrianRasmussen.com is the permanent home and only writable authority. It holds identity, steward state, transfers, inscriptions, provenance, privacy controls and recovery evidence.</w:t>
       </w:r>
     </w:p>
     <w:p>
@@ -646,7 +646,7 @@
           <w:color w:val="262321"/>
           <w:sz w:val="22"/>
         </w:rPr>
-        <w:t>There is one current keeper, never one answer on each website.</w:t>
+        <w:t>There is one current steward, never one answer on each website.</w:t>
       </w:r>
     </w:p>
     <w:p>
@@ -747,7 +747,7 @@
           <w:color w:val="262321"/>
           <w:sz w:val="22"/>
         </w:rPr>
-        <w:t>The map can connect artworks, exhibitions, broad locations, keepers who choose to be visible, dreams that they choose to share, and future coherence relationships. Exact addresses, birthdates and private custody data are never required for the public map.</w:t>
+        <w:t>The map can connect artworks, exhibitions, broad locations, stewards who choose to be visible, dreams that they choose to share, and future coherence relationships. Exact addresses, birthdates and private custody data are never required for the public map.</w:t>
       </w:r>
     </w:p>
     <w:p>
@@ -770,7 +770,7 @@
         <w:keepNext/>
       </w:pPr>
       <w:r>
-        <w:t>First keeper</w:t>
+        <w:t>First steward</w:t>
       </w:r>
     </w:p>
     <w:p>
@@ -783,7 +783,7 @@
           <w:color w:val="262321"/>
           <w:sz w:val="22"/>
         </w:rPr>
-        <w:t>The first keeper creates or uses an account with a verified email, a full name and a private birthdate. They enter the Ownership Code from the underside. If the plate is active and unclaimed, the artwork binds to that account and the first keeper receives the complete private artwork archive.</w:t>
+        <w:t>The first steward creates or uses an account with a verified email, a full name and a private birthdate. They enter the Ownership Code from the underside. If the plate is active and unclaimed, the artwork binds to that account and the first steward receives the complete private artwork archive.</w:t>
       </w:r>
     </w:p>
     <w:p>
@@ -824,7 +824,7 @@
           <w:color w:val="262321"/>
           <w:sz w:val="22"/>
         </w:rPr>
-        <w:t>The current keeper receives the buyer's verified name, email and explanation.</w:t>
+        <w:t>The current steward receives the buyer's verified name, email and explanation.</w:t>
       </w:r>
     </w:p>
     <w:p>
@@ -840,7 +840,7 @@
           <w:color w:val="262321"/>
           <w:sz w:val="22"/>
         </w:rPr>
-        <w:t>The current keeper presses Approve transfer.</w:t>
+        <w:t>The current steward presses Approve transfer.</w:t>
       </w:r>
     </w:p>
     <w:p>
@@ -856,7 +856,7 @@
           <w:color w:val="262321"/>
           <w:sz w:val="22"/>
         </w:rPr>
-        <w:t>The canonical keeper changes immediately and both parties are notified.</w:t>
+        <w:t>The registry records the new steward immediately and both parties are notified.</w:t>
       </w:r>
     </w:p>
     <w:p>
@@ -872,7 +872,7 @@
           <w:color w:val="262321"/>
           <w:sz w:val="22"/>
         </w:rPr>
-        <w:t>The permanent code stays with the artwork and the complete artwork history unlocks for the new keeper.</w:t>
+        <w:t>The permanent code stays with the artwork and the complete artwork history unlocks for the new steward.</w:t>
       </w:r>
     </w:p>
     <w:p>
@@ -894,7 +894,7 @@
           <w:color w:val="262321"/>
           <w:sz w:val="22"/>
         </w:rPr>
-        <w:t>If the current keeper does not respond, the registry sends notices at the opening of the claim and on days 10, 20 and 27. At the first steward run after day 30, continued silence allows physical possession plus the correct code to recover the artwork. An individual dead mailbox cannot orphan the piece forever; a system-wide email outage pauses automation.</w:t>
+        <w:t>If the current steward does not respond, the registry sends notices at the opening of the claim and on days 10, 20 and 27. At the first successful run of the claim scheduler after day 30, continued silence allows physical possession plus the correct code to recover the artwork. An individual dead mailbox cannot orphan the piece forever; a system-wide email outage pauses automation.</w:t>
       </w:r>
     </w:p>
     <w:p>
@@ -903,7 +903,7 @@
         <w:keepNext/>
       </w:pPr>
       <w:r>
-        <w:t>When the keeper says no</w:t>
+        <w:t>When the steward says no</w:t>
       </w:r>
     </w:p>
     <w:p>
@@ -916,7 +916,7 @@
           <w:color w:val="262321"/>
           <w:sz w:val="22"/>
         </w:rPr>
-        <w:t>An explicit denial stops automatic transfer. The keeper supplies a reason, the claimant receives it through a masked email relay, and the case becomes a dispute rather than an automated handoff. Theft and legal disputes are preserved for communication, police or court resolution; neither an infrastructure custodian nor a single administrator may simply choose a winner.</w:t>
+        <w:t>An explicit denial stops automatic transfer. The steward supplies a reason, the claimant receives it through a masked email relay, and the case becomes a dispute rather than an automated handoff. Theft and legal disputes are preserved for communication, police or court resolution; neither a registry custodian nor a single administrator may simply choose a winner.</w:t>
       </w:r>
     </w:p>
     <w:p>
@@ -938,7 +938,7 @@
           <w:color w:val="262321"/>
           <w:sz w:val="22"/>
         </w:rPr>
-        <w:t>The keeper sees the claimant's verified name, email and explanation. IP address, user agent and technical evidence remain restricted to registry administration and lawful dispute handling. The Ownership Code never appears in email or a URL.</w:t>
+        <w:t>The steward sees the claimant's verified name, email and explanation. IP address, user agent and technical evidence remain restricted to registry administration and lawful dispute handling. The Ownership Code never appears in email or a URL.</w:t>
       </w:r>
     </w:p>
     <w:p>
@@ -1140,7 +1140,7 @@
           <w:color w:val="262321"/>
           <w:sz w:val="22"/>
         </w:rPr>
-        <w:t>Adrian can build these records while he is the keeper. After transfer, the current keeper controls new custody and location records. Adrian may propose a historical or exhibition entry, but the keeper confirms it before private location information is stored or shown.</w:t>
+        <w:t>Adrian can build these records while he is the steward. After transfer, the current steward controls new custody and location records. Adrian may propose a historical or exhibition entry, but the steward confirms it before private location information is stored or shown.</w:t>
       </w:r>
     </w:p>
     <w:p>
@@ -1162,7 +1162,7 @@
           <w:color w:val="262321"/>
           <w:sz w:val="22"/>
         </w:rPr>
-        <w:t>The new keeper receives everything about the artwork, not the former keeper's security profile. Birthdates, login data, IP evidence, payment credentials, unrelated account notes and exact private addresses do not pass forward. Artwork documents are redacted of unrelated personal information before joining the permanent archive.</w:t>
+        <w:t>The new steward receives everything about the artwork, not the former steward's security profile. Birthdates, login data, IP evidence, payment credentials, unrelated account notes and exact private addresses do not pass forward. Artwork documents are redacted of unrelated personal information before joining the permanent archive.</w:t>
       </w:r>
     </w:p>
     <w:p>
@@ -1189,7 +1189,7 @@
           <w:color w:val="262321"/>
           <w:sz w:val="22"/>
         </w:rPr>
-        <w:t>A confirmed record remains part of the artwork's history, but visibility can change. The keeper may show a dream today, hide it tomorrow and make it visible again later. Hiding changes presentation, not history.</w:t>
+        <w:t>A confirmed record remains part of the artwork's history, but visibility can change. The steward may show a dream today, hide it tomorrow and make it visible again later. Hiding changes presentation, not history.</w:t>
       </w:r>
     </w:p>
     <w:tbl>
@@ -1261,7 +1261,7 @@
                 <w:color w:val="262321"/>
                 <w:sz w:val="19"/>
               </w:rPr>
-              <w:t>Keeper-private archive</w:t>
+              <w:t>Steward’s private archive</w:t>
             </w:r>
           </w:p>
         </w:tc>
@@ -1319,7 +1319,7 @@
                 <w:color w:val="262321"/>
                 <w:sz w:val="18"/>
               </w:rPr>
-              <w:t>Artwork identity, selected story, public materials, exhibitions, opted-in keeper profile and dreams.</w:t>
+              <w:t>Artwork identity, selected story, public materials, exhibitions, opted-in steward profile and dreams.</w:t>
             </w:r>
           </w:p>
         </w:tc>
@@ -1433,7 +1433,7 @@
                 <w:color w:val="262321"/>
                 <w:sz w:val="18"/>
               </w:rPr>
-              <w:t>Transfers to each confirmed keeper with the artwork, after unrelated personal data is removed.</w:t>
+              <w:t>Transfers to each confirmed steward with the artwork, after unrelated personal data is removed.</w:t>
             </w:r>
           </w:p>
         </w:tc>
@@ -1487,7 +1487,7 @@
           <w:color w:val="262321"/>
           <w:sz w:val="22"/>
         </w:rPr>
-        <w:t>A claimant does not automatically see the private archive. They may request access. The current keeper chooses individual records and a short viewing period. After a confirmed transfer, the new keeper receives the complete artwork-attached archive.</w:t>
+        <w:t>A claimant does not automatically see the private archive. They may request access. The current steward chooses individual records and a short viewing period. After a confirmed transfer, the new steward receives the complete artwork-attached archive.</w:t>
       </w:r>
     </w:p>
     <w:p>
@@ -1593,7 +1593,7 @@
           <w:color w:val="262321"/>
           <w:sz w:val="22"/>
         </w:rPr>
-        <w:t>Origin inscription: one message from the first keeper who brought the work into its first custodial form.</w:t>
+        <w:t>Origin inscription: one message from the first steward who brought the work into its first custodial form.</w:t>
       </w:r>
     </w:p>
     <w:p>
@@ -1609,7 +1609,7 @@
           <w:color w:val="262321"/>
           <w:sz w:val="22"/>
         </w:rPr>
-        <w:t>Annual keeper inscription: one opportunity each year within fourteen days before or after the keeper's birthday.</w:t>
+        <w:t>Annual steward inscription: one opportunity each year within fourteen days before or after the steward's birthday.</w:t>
       </w:r>
     </w:p>
     <w:p>
@@ -1631,7 +1631,7 @@
         <w:keepNext/>
       </w:pPr>
       <w:r>
-        <w:t>A keeper's public presence</w:t>
+        <w:t>A steward's public presence</w:t>
       </w:r>
     </w:p>
     <w:p>
@@ -1644,7 +1644,7 @@
           <w:color w:val="262321"/>
           <w:sz w:val="22"/>
         </w:rPr>
-        <w:t>A keeper may choose to be visible beside the artwork. They can show a selected name, dream or purpose, website, social links and broad location. Each field can be hidden and enabled again independently. If the profile is hidden, the public lineage simply shows a private keeper period.</w:t>
+        <w:t>A steward may choose to be visible beside the artwork. They can show a selected name, dream or purpose, website, social links and broad location. Each field can be hidden and enabled again independently. If the profile is hidden, the public lineage simply shows a private steward period.</w:t>
       </w:r>
     </w:p>
     <w:p>
@@ -1666,7 +1666,7 @@
           <w:color w:val="262321"/>
           <w:sz w:val="22"/>
         </w:rPr>
-        <w:t>Public dreams, opted-in keeper profiles and permitted chart coherence can form a wider constellation of people, artworks and intentions. The relationship is invitational rather than compulsory. Birthdates remain private even when coherence is enabled.</w:t>
+        <w:t>Public dreams, opted-in steward profiles and permitted chart coherence can form a wider constellation of people, artworks and intentions. The relationship is invitational rather than compulsory. Birthdates remain private even when coherence is enabled.</w:t>
       </w:r>
     </w:p>
     <w:p>
@@ -1810,7 +1810,7 @@
           <w:color w:val="262321"/>
           <w:sz w:val="22"/>
         </w:rPr>
-        <w:t>The system separates the person who can retrieve encrypted backups from the person who holds decryption material. Restoring or changing production requires both. The ordinary custodian can verify, recover and request a reviewed redeployment, but cannot approve claims, transfer artwork or browse keeper archives.</w:t>
+        <w:t>The system separates the person who can retrieve encrypted backups from the person who holds decryption material. Restoring or changing production requires both. The registry custodian can verify, recover and request a reviewed redeployment, but cannot approve claims, transfer artwork or browse steward archives.</w:t>
       </w:r>
     </w:p>
     <w:p>
@@ -1943,7 +1943,7 @@
           <w:color w:val="262321"/>
           <w:sz w:val="22"/>
         </w:rPr>
-        <w:t>Use controlled accounts to complete first keeper registration, an immediate approved transfer, a denied claim and a timed silence claim. Disable Mandala's ownership writes before Adrian's canonical transfer system becomes live.</w:t>
+        <w:t>Use controlled accounts to complete first steward registration, an immediate approved transfer, a denied claim and a timed silence claim. Disable Mandala's ownership writes before Adrian's canonical transfer system becomes live.</w:t>
       </w:r>
     </w:p>
     <w:p>
@@ -1965,7 +1965,7 @@
           <w:color w:val="262321"/>
           <w:sz w:val="22"/>
         </w:rPr>
-        <w:t>Add materials, makers, exhibitions, private financial history, inscriptions, public keeper profiles, dream connections, dual maps and daily checkpoint verification in successive gated releases.</w:t>
+        <w:t>Add materials, makers, exhibitions, private financial history, inscriptions, public steward profiles, dream connections, dual maps and daily checkpoint verification in successive gated releases.</w:t>
       </w:r>
     </w:p>
     <w:p>
@@ -2058,7 +2058,7 @@
           <w:color w:val="262321"/>
           <w:sz w:val="22"/>
         </w:rPr>
-        <w:t>Immediate transfer when both keepers agree.</w:t>
+        <w:t>Immediate transfer when both stewards agree.</w:t>
       </w:r>
     </w:p>
     <w:p>
@@ -2074,7 +2074,7 @@
           <w:color w:val="262321"/>
           <w:sz w:val="22"/>
         </w:rPr>
-        <w:t>Patient recovery when the old keeper is silent.</w:t>
+        <w:t>Patient recovery when the old steward is silent.</w:t>
       </w:r>
     </w:p>
     <w:p>
@@ -2192,7 +2192,7 @@
           <w:color w:val="262321"/>
           <w:sz w:val="22"/>
         </w:rPr>
-        <w:t>The Adrian Rasmussen Artwork Registry is a living lineage for physical art. A permanent metal plate connects each work to one enduring identity. Its public face opens the story; its hidden face proves possession. The registry remembers the people, places, materials, dreams and transfers that gather around the object, while allowing each keeper to decide what the world can see. The artwork can move, the websites can change, and the keeper can disappear, but the piece still carries a path home.</w:t>
+        <w:t>The Adrian Rasmussen Artwork Registry is a living lineage for physical art. A permanent metal plate connects each work to one enduring identity. Its public face opens the story; its hidden face proves possession. The registry remembers the people, places, materials, dreams and transfers that gather around the object, while allowing each steward to decide what the world can see. The artwork can move, the websites can change, and the steward can disappear, but the piece still carries a path home.</w:t>
       </w:r>
     </w:p>
     <w:p>

</xml_diff>